<commit_message>
A lot of stuff
</commit_message>
<xml_diff>
--- a/public/doc-templates/TA/ba-expo-ta.docx
+++ b/public/doc-templates/TA/ba-expo-ta.docx
@@ -1,6 +1,6 @@
 
 <file path=word/document.xml><?xml version="1.0" encoding="utf-8"?>
-<w:document xmlns:wpc="http://schemas.microsoft.com/office/word/2010/wordprocessingCanvas" xmlns:cx="http://schemas.microsoft.com/office/drawing/2014/chartex" xmlns:cx1="http://schemas.microsoft.com/office/drawing/2015/9/8/chartex" xmlns:cx2="http://schemas.microsoft.com/office/drawing/2015/10/21/chartex" xmlns:cx3="http://schemas.microsoft.com/office/drawing/2016/5/9/chartex" xmlns:cx4="http://schemas.microsoft.com/office/drawing/2016/5/10/chartex" xmlns:cx5="http://schemas.microsoft.com/office/drawing/2016/5/11/chartex" xmlns:cx6="http://schemas.microsoft.com/office/drawing/2016/5/12/chartex" xmlns:cx7="http://schemas.microsoft.com/office/drawing/2016/5/13/chartex" xmlns:cx8="http://schemas.microsoft.com/office/drawing/2016/5/14/chartex" xmlns:mc="http://schemas.openxmlformats.org/markup-compatibility/2006" xmlns:aink="http://schemas.microsoft.com/office/drawing/2016/ink" xmlns:am3d="http://schemas.microsoft.com/office/drawing/2017/model3d" xmlns:o="urn:schemas-microsoft-com:office:office" xmlns:oel="http://schemas.microsoft.com/office/2019/extlst" xmlns:r="http://schemas.openxmlformats.org/officeDocument/2006/relationships" xmlns:m="http://schemas.openxmlformats.org/officeDocument/2006/math" xmlns:v="urn:schemas-microsoft-com:vml" xmlns:wp14="http://schemas.microsoft.com/office/word/2010/wordprocessingDrawing" xmlns:wp="http://schemas.openxmlformats.org/drawingml/2006/wordprocessingDrawing" xmlns:w10="urn:schemas-microsoft-com:office:word" xmlns:w="http://schemas.openxmlformats.org/wordprocessingml/2006/main" xmlns:w14="http://schemas.microsoft.com/office/word/2010/wordml" xmlns:w15="http://schemas.microsoft.com/office/word/2012/wordml" xmlns:w16cei="http://schemas.microsoft.com/office/word/2026/wordml/cei" xmlns:w16cex="http://schemas.microsoft.com/office/word/2018/wordml/cex" xmlns:w16cid="http://schemas.microsoft.com/office/word/2016/wordml/cid" xmlns:w16="http://schemas.microsoft.com/office/word/2018/wordml" xmlns:w16du="http://schemas.microsoft.com/office/word/2023/wordml/word16du" xmlns:w16sdtdh="http://schemas.microsoft.com/office/word/2020/wordml/sdtdatahash" xmlns:w16sdtfl="http://schemas.microsoft.com/office/word/2024/wordml/sdtformatlock" xmlns:w16se="http://schemas.microsoft.com/office/word/2015/wordml/symex" xmlns:wpg="http://schemas.microsoft.com/office/word/2010/wordprocessingGroup" xmlns:wpi="http://schemas.microsoft.com/office/word/2010/wordprocessingInk" xmlns:wne="http://schemas.microsoft.com/office/word/2006/wordml" xmlns:wps="http://schemas.microsoft.com/office/word/2010/wordprocessingShape" mc:Ignorable="w14 w15 w16se w16cid w16 w16cex w16sdtdh w16sdtfl w16du wp14">
+<w:document xmlns:wpc="http://schemas.microsoft.com/office/word/2010/wordprocessingCanvas" xmlns:cx="http://schemas.microsoft.com/office/drawing/2014/chartex" xmlns:cx1="http://schemas.microsoft.com/office/drawing/2015/9/8/chartex" xmlns:cx2="http://schemas.microsoft.com/office/drawing/2015/10/21/chartex" xmlns:cx3="http://schemas.microsoft.com/office/drawing/2016/5/9/chartex" xmlns:cx4="http://schemas.microsoft.com/office/drawing/2016/5/10/chartex" xmlns:cx5="http://schemas.microsoft.com/office/drawing/2016/5/11/chartex" xmlns:cx6="http://schemas.microsoft.com/office/drawing/2016/5/12/chartex" xmlns:cx7="http://schemas.microsoft.com/office/drawing/2016/5/13/chartex" xmlns:cx8="http://schemas.microsoft.com/office/drawing/2016/5/14/chartex" xmlns:mc="http://schemas.openxmlformats.org/markup-compatibility/2006" xmlns:aink="http://schemas.microsoft.com/office/drawing/2016/ink" xmlns:am3d="http://schemas.microsoft.com/office/drawing/2017/model3d" xmlns:o="urn:schemas-microsoft-com:office:office" xmlns:oel="http://schemas.microsoft.com/office/2019/extlst" xmlns:r="http://schemas.openxmlformats.org/officeDocument/2006/relationships" xmlns:m="http://schemas.openxmlformats.org/officeDocument/2006/math" xmlns:v="urn:schemas-microsoft-com:vml" xmlns:wp14="http://schemas.microsoft.com/office/word/2010/wordprocessingDrawing" xmlns:wp="http://schemas.openxmlformats.org/drawingml/2006/wordprocessingDrawing" xmlns:w10="urn:schemas-microsoft-com:office:word" xmlns:w="http://schemas.openxmlformats.org/wordprocessingml/2006/main" xmlns:w14="http://schemas.microsoft.com/office/word/2010/wordml" xmlns:w15="http://schemas.microsoft.com/office/word/2012/wordml" xmlns:w16cex="http://schemas.microsoft.com/office/word/2018/wordml/cex" xmlns:w16cid="http://schemas.microsoft.com/office/word/2016/wordml/cid" xmlns:w16="http://schemas.microsoft.com/office/word/2018/wordml" xmlns:w16du="http://schemas.microsoft.com/office/word/2023/wordml/word16du" xmlns:w16sdtdh="http://schemas.microsoft.com/office/word/2020/wordml/sdtdatahash" xmlns:w16sdtfl="http://schemas.microsoft.com/office/word/2024/wordml/sdtformatlock" xmlns:w16se="http://schemas.microsoft.com/office/word/2015/wordml/symex" xmlns:wpg="http://schemas.microsoft.com/office/word/2010/wordprocessingGroup" xmlns:wpi="http://schemas.microsoft.com/office/word/2010/wordprocessingInk" xmlns:wne="http://schemas.microsoft.com/office/word/2006/wordml" xmlns:wps="http://schemas.microsoft.com/office/word/2010/wordprocessingShape" mc:Ignorable="w14 w15 w16se w16cid w16 w16cex w16sdtdh w16sdtfl w16du wp14">
   <w:body>
     <w:p>
       <w:pPr>
@@ -1788,45 +1788,6 @@
           <w:szCs w:val="24"/>
         </w:rPr>
       </w:pPr>
-    </w:p>
-    <w:p>
-      <w:pPr>
-        <w:spacing w:after="0" w:line="240" w:lineRule="auto"/>
-        <w:jc w:val="center"/>
-        <w:rPr>
-          <w:rFonts w:ascii="Times New Roman" w:hAnsi="Times New Roman" w:cs="Times New Roman"/>
-          <w:b/>
-          <w:bCs/>
-          <w:sz w:val="24"/>
-          <w:szCs w:val="24"/>
-        </w:rPr>
-      </w:pPr>
-    </w:p>
-    <w:p>
-      <w:pPr>
-        <w:spacing w:after="0" w:line="240" w:lineRule="auto"/>
-        <w:jc w:val="center"/>
-        <w:rPr>
-          <w:rFonts w:ascii="Times New Roman" w:hAnsi="Times New Roman" w:cs="Times New Roman"/>
-          <w:b/>
-          <w:bCs/>
-          <w:sz w:val="24"/>
-          <w:szCs w:val="24"/>
-        </w:rPr>
-      </w:pPr>
-    </w:p>
-    <w:p>
-      <w:pPr>
-        <w:spacing w:after="0" w:line="240" w:lineRule="auto"/>
-        <w:jc w:val="center"/>
-        <w:rPr>
-          <w:rFonts w:ascii="Times New Roman" w:hAnsi="Times New Roman" w:cs="Times New Roman"/>
-          <w:b/>
-          <w:bCs/>
-          <w:sz w:val="24"/>
-          <w:szCs w:val="24"/>
-        </w:rPr>
-      </w:pPr>
       <w:r>
         <w:rPr>
           <w:rFonts w:ascii="Times New Roman" w:hAnsi="Times New Roman" w:cs="Times New Roman"/>
@@ -4616,7 +4577,7 @@
 </file>
 
 <file path=word/endnotes.xml><?xml version="1.0" encoding="utf-8"?>
-<w:endnotes xmlns:wpc="http://schemas.microsoft.com/office/word/2010/wordprocessingCanvas" xmlns:cx="http://schemas.microsoft.com/office/drawing/2014/chartex" xmlns:cx1="http://schemas.microsoft.com/office/drawing/2015/9/8/chartex" xmlns:cx2="http://schemas.microsoft.com/office/drawing/2015/10/21/chartex" xmlns:cx3="http://schemas.microsoft.com/office/drawing/2016/5/9/chartex" xmlns:cx4="http://schemas.microsoft.com/office/drawing/2016/5/10/chartex" xmlns:cx5="http://schemas.microsoft.com/office/drawing/2016/5/11/chartex" xmlns:cx6="http://schemas.microsoft.com/office/drawing/2016/5/12/chartex" xmlns:cx7="http://schemas.microsoft.com/office/drawing/2016/5/13/chartex" xmlns:cx8="http://schemas.microsoft.com/office/drawing/2016/5/14/chartex" xmlns:mc="http://schemas.openxmlformats.org/markup-compatibility/2006" xmlns:aink="http://schemas.microsoft.com/office/drawing/2016/ink" xmlns:am3d="http://schemas.microsoft.com/office/drawing/2017/model3d" xmlns:o="urn:schemas-microsoft-com:office:office" xmlns:oel="http://schemas.microsoft.com/office/2019/extlst" xmlns:r="http://schemas.openxmlformats.org/officeDocument/2006/relationships" xmlns:m="http://schemas.openxmlformats.org/officeDocument/2006/math" xmlns:v="urn:schemas-microsoft-com:vml" xmlns:wp14="http://schemas.microsoft.com/office/word/2010/wordprocessingDrawing" xmlns:wp="http://schemas.openxmlformats.org/drawingml/2006/wordprocessingDrawing" xmlns:w10="urn:schemas-microsoft-com:office:word" xmlns:w="http://schemas.openxmlformats.org/wordprocessingml/2006/main" xmlns:w14="http://schemas.microsoft.com/office/word/2010/wordml" xmlns:w15="http://schemas.microsoft.com/office/word/2012/wordml" xmlns:w16cei="http://schemas.microsoft.com/office/word/2026/wordml/cei" xmlns:w16cex="http://schemas.microsoft.com/office/word/2018/wordml/cex" xmlns:w16cid="http://schemas.microsoft.com/office/word/2016/wordml/cid" xmlns:w16="http://schemas.microsoft.com/office/word/2018/wordml" xmlns:w16du="http://schemas.microsoft.com/office/word/2023/wordml/word16du" xmlns:w16sdtdh="http://schemas.microsoft.com/office/word/2020/wordml/sdtdatahash" xmlns:w16sdtfl="http://schemas.microsoft.com/office/word/2024/wordml/sdtformatlock" xmlns:w16se="http://schemas.microsoft.com/office/word/2015/wordml/symex" xmlns:wpg="http://schemas.microsoft.com/office/word/2010/wordprocessingGroup" xmlns:wpi="http://schemas.microsoft.com/office/word/2010/wordprocessingInk" xmlns:wne="http://schemas.microsoft.com/office/word/2006/wordml" xmlns:wps="http://schemas.microsoft.com/office/word/2010/wordprocessingShape" mc:Ignorable="w14 w15 w16se w16cid w16 w16cex w16sdtdh w16sdtfl w16du wp14">
+<w:endnotes xmlns:wpc="http://schemas.microsoft.com/office/word/2010/wordprocessingCanvas" xmlns:cx="http://schemas.microsoft.com/office/drawing/2014/chartex" xmlns:cx1="http://schemas.microsoft.com/office/drawing/2015/9/8/chartex" xmlns:cx2="http://schemas.microsoft.com/office/drawing/2015/10/21/chartex" xmlns:cx3="http://schemas.microsoft.com/office/drawing/2016/5/9/chartex" xmlns:cx4="http://schemas.microsoft.com/office/drawing/2016/5/10/chartex" xmlns:cx5="http://schemas.microsoft.com/office/drawing/2016/5/11/chartex" xmlns:cx6="http://schemas.microsoft.com/office/drawing/2016/5/12/chartex" xmlns:cx7="http://schemas.microsoft.com/office/drawing/2016/5/13/chartex" xmlns:cx8="http://schemas.microsoft.com/office/drawing/2016/5/14/chartex" xmlns:mc="http://schemas.openxmlformats.org/markup-compatibility/2006" xmlns:aink="http://schemas.microsoft.com/office/drawing/2016/ink" xmlns:am3d="http://schemas.microsoft.com/office/drawing/2017/model3d" xmlns:o="urn:schemas-microsoft-com:office:office" xmlns:oel="http://schemas.microsoft.com/office/2019/extlst" xmlns:r="http://schemas.openxmlformats.org/officeDocument/2006/relationships" xmlns:m="http://schemas.openxmlformats.org/officeDocument/2006/math" xmlns:v="urn:schemas-microsoft-com:vml" xmlns:wp14="http://schemas.microsoft.com/office/word/2010/wordprocessingDrawing" xmlns:wp="http://schemas.openxmlformats.org/drawingml/2006/wordprocessingDrawing" xmlns:w10="urn:schemas-microsoft-com:office:word" xmlns:w="http://schemas.openxmlformats.org/wordprocessingml/2006/main" xmlns:w14="http://schemas.microsoft.com/office/word/2010/wordml" xmlns:w15="http://schemas.microsoft.com/office/word/2012/wordml" xmlns:w16cex="http://schemas.microsoft.com/office/word/2018/wordml/cex" xmlns:w16cid="http://schemas.microsoft.com/office/word/2016/wordml/cid" xmlns:w16="http://schemas.microsoft.com/office/word/2018/wordml" xmlns:w16du="http://schemas.microsoft.com/office/word/2023/wordml/word16du" xmlns:w16sdtdh="http://schemas.microsoft.com/office/word/2020/wordml/sdtdatahash" xmlns:w16sdtfl="http://schemas.microsoft.com/office/word/2024/wordml/sdtformatlock" xmlns:w16se="http://schemas.microsoft.com/office/word/2015/wordml/symex" xmlns:wpg="http://schemas.microsoft.com/office/word/2010/wordprocessingGroup" xmlns:wpi="http://schemas.microsoft.com/office/word/2010/wordprocessingInk" xmlns:wne="http://schemas.microsoft.com/office/word/2006/wordml" xmlns:wps="http://schemas.microsoft.com/office/word/2010/wordprocessingShape" mc:Ignorable="w14 w15 w16se w16cid w16 w16cex w16sdtdh w16sdtfl w16du wp14">
   <w:endnote w:type="separator" w:id="-1">
     <w:p>
       <w:pPr>
@@ -4641,7 +4602,7 @@
 </file>
 
 <file path=word/footnotes.xml><?xml version="1.0" encoding="utf-8"?>
-<w:footnotes xmlns:wpc="http://schemas.microsoft.com/office/word/2010/wordprocessingCanvas" xmlns:cx="http://schemas.microsoft.com/office/drawing/2014/chartex" xmlns:cx1="http://schemas.microsoft.com/office/drawing/2015/9/8/chartex" xmlns:cx2="http://schemas.microsoft.com/office/drawing/2015/10/21/chartex" xmlns:cx3="http://schemas.microsoft.com/office/drawing/2016/5/9/chartex" xmlns:cx4="http://schemas.microsoft.com/office/drawing/2016/5/10/chartex" xmlns:cx5="http://schemas.microsoft.com/office/drawing/2016/5/11/chartex" xmlns:cx6="http://schemas.microsoft.com/office/drawing/2016/5/12/chartex" xmlns:cx7="http://schemas.microsoft.com/office/drawing/2016/5/13/chartex" xmlns:cx8="http://schemas.microsoft.com/office/drawing/2016/5/14/chartex" xmlns:mc="http://schemas.openxmlformats.org/markup-compatibility/2006" xmlns:aink="http://schemas.microsoft.com/office/drawing/2016/ink" xmlns:am3d="http://schemas.microsoft.com/office/drawing/2017/model3d" xmlns:o="urn:schemas-microsoft-com:office:office" xmlns:oel="http://schemas.microsoft.com/office/2019/extlst" xmlns:r="http://schemas.openxmlformats.org/officeDocument/2006/relationships" xmlns:m="http://schemas.openxmlformats.org/officeDocument/2006/math" xmlns:v="urn:schemas-microsoft-com:vml" xmlns:wp14="http://schemas.microsoft.com/office/word/2010/wordprocessingDrawing" xmlns:wp="http://schemas.openxmlformats.org/drawingml/2006/wordprocessingDrawing" xmlns:w10="urn:schemas-microsoft-com:office:word" xmlns:w="http://schemas.openxmlformats.org/wordprocessingml/2006/main" xmlns:w14="http://schemas.microsoft.com/office/word/2010/wordml" xmlns:w15="http://schemas.microsoft.com/office/word/2012/wordml" xmlns:w16cei="http://schemas.microsoft.com/office/word/2026/wordml/cei" xmlns:w16cex="http://schemas.microsoft.com/office/word/2018/wordml/cex" xmlns:w16cid="http://schemas.microsoft.com/office/word/2016/wordml/cid" xmlns:w16="http://schemas.microsoft.com/office/word/2018/wordml" xmlns:w16du="http://schemas.microsoft.com/office/word/2023/wordml/word16du" xmlns:w16sdtdh="http://schemas.microsoft.com/office/word/2020/wordml/sdtdatahash" xmlns:w16sdtfl="http://schemas.microsoft.com/office/word/2024/wordml/sdtformatlock" xmlns:w16se="http://schemas.microsoft.com/office/word/2015/wordml/symex" xmlns:wpg="http://schemas.microsoft.com/office/word/2010/wordprocessingGroup" xmlns:wpi="http://schemas.microsoft.com/office/word/2010/wordprocessingInk" xmlns:wne="http://schemas.microsoft.com/office/word/2006/wordml" xmlns:wps="http://schemas.microsoft.com/office/word/2010/wordprocessingShape" mc:Ignorable="w14 w15 w16se w16cid w16 w16cex w16sdtdh w16sdtfl w16du wp14">
+<w:footnotes xmlns:wpc="http://schemas.microsoft.com/office/word/2010/wordprocessingCanvas" xmlns:cx="http://schemas.microsoft.com/office/drawing/2014/chartex" xmlns:cx1="http://schemas.microsoft.com/office/drawing/2015/9/8/chartex" xmlns:cx2="http://schemas.microsoft.com/office/drawing/2015/10/21/chartex" xmlns:cx3="http://schemas.microsoft.com/office/drawing/2016/5/9/chartex" xmlns:cx4="http://schemas.microsoft.com/office/drawing/2016/5/10/chartex" xmlns:cx5="http://schemas.microsoft.com/office/drawing/2016/5/11/chartex" xmlns:cx6="http://schemas.microsoft.com/office/drawing/2016/5/12/chartex" xmlns:cx7="http://schemas.microsoft.com/office/drawing/2016/5/13/chartex" xmlns:cx8="http://schemas.microsoft.com/office/drawing/2016/5/14/chartex" xmlns:mc="http://schemas.openxmlformats.org/markup-compatibility/2006" xmlns:aink="http://schemas.microsoft.com/office/drawing/2016/ink" xmlns:am3d="http://schemas.microsoft.com/office/drawing/2017/model3d" xmlns:o="urn:schemas-microsoft-com:office:office" xmlns:oel="http://schemas.microsoft.com/office/2019/extlst" xmlns:r="http://schemas.openxmlformats.org/officeDocument/2006/relationships" xmlns:m="http://schemas.openxmlformats.org/officeDocument/2006/math" xmlns:v="urn:schemas-microsoft-com:vml" xmlns:wp14="http://schemas.microsoft.com/office/word/2010/wordprocessingDrawing" xmlns:wp="http://schemas.openxmlformats.org/drawingml/2006/wordprocessingDrawing" xmlns:w10="urn:schemas-microsoft-com:office:word" xmlns:w="http://schemas.openxmlformats.org/wordprocessingml/2006/main" xmlns:w14="http://schemas.microsoft.com/office/word/2010/wordml" xmlns:w15="http://schemas.microsoft.com/office/word/2012/wordml" xmlns:w16cex="http://schemas.microsoft.com/office/word/2018/wordml/cex" xmlns:w16cid="http://schemas.microsoft.com/office/word/2016/wordml/cid" xmlns:w16="http://schemas.microsoft.com/office/word/2018/wordml" xmlns:w16du="http://schemas.microsoft.com/office/word/2023/wordml/word16du" xmlns:w16sdtdh="http://schemas.microsoft.com/office/word/2020/wordml/sdtdatahash" xmlns:w16sdtfl="http://schemas.microsoft.com/office/word/2024/wordml/sdtformatlock" xmlns:w16se="http://schemas.microsoft.com/office/word/2015/wordml/symex" xmlns:wpg="http://schemas.microsoft.com/office/word/2010/wordprocessingGroup" xmlns:wpi="http://schemas.microsoft.com/office/word/2010/wordprocessingInk" xmlns:wne="http://schemas.microsoft.com/office/word/2006/wordml" xmlns:wps="http://schemas.microsoft.com/office/word/2010/wordprocessingShape" mc:Ignorable="w14 w15 w16se w16cid w16 w16cex w16sdtdh w16sdtfl w16du wp14">
   <w:footnote w:type="separator" w:id="-1">
     <w:p>
       <w:pPr>
@@ -4666,866 +4627,344 @@
 </file>
 
 <file path=word/header1.xml><?xml version="1.0" encoding="utf-8"?>
-<w:hdr xmlns:wpc="http://schemas.microsoft.com/office/word/2010/wordprocessingCanvas" xmlns:cx="http://schemas.microsoft.com/office/drawing/2014/chartex" xmlns:cx1="http://schemas.microsoft.com/office/drawing/2015/9/8/chartex" xmlns:cx2="http://schemas.microsoft.com/office/drawing/2015/10/21/chartex" xmlns:cx3="http://schemas.microsoft.com/office/drawing/2016/5/9/chartex" xmlns:cx4="http://schemas.microsoft.com/office/drawing/2016/5/10/chartex" xmlns:cx5="http://schemas.microsoft.com/office/drawing/2016/5/11/chartex" xmlns:cx6="http://schemas.microsoft.com/office/drawing/2016/5/12/chartex" xmlns:cx7="http://schemas.microsoft.com/office/drawing/2016/5/13/chartex" xmlns:cx8="http://schemas.microsoft.com/office/drawing/2016/5/14/chartex" xmlns:mc="http://schemas.openxmlformats.org/markup-compatibility/2006" xmlns:aink="http://schemas.microsoft.com/office/drawing/2016/ink" xmlns:am3d="http://schemas.microsoft.com/office/drawing/2017/model3d" xmlns:o="urn:schemas-microsoft-com:office:office" xmlns:oel="http://schemas.microsoft.com/office/2019/extlst" xmlns:r="http://schemas.openxmlformats.org/officeDocument/2006/relationships" xmlns:m="http://schemas.openxmlformats.org/officeDocument/2006/math" xmlns:v="urn:schemas-microsoft-com:vml" xmlns:wp14="http://schemas.microsoft.com/office/word/2010/wordprocessingDrawing" xmlns:wp="http://schemas.openxmlformats.org/drawingml/2006/wordprocessingDrawing" xmlns:w10="urn:schemas-microsoft-com:office:word" xmlns:w="http://schemas.openxmlformats.org/wordprocessingml/2006/main" xmlns:w14="http://schemas.microsoft.com/office/word/2010/wordml" xmlns:w15="http://schemas.microsoft.com/office/word/2012/wordml" xmlns:w16cei="http://schemas.microsoft.com/office/word/2026/wordml/cei" xmlns:w16cex="http://schemas.microsoft.com/office/word/2018/wordml/cex" xmlns:w16cid="http://schemas.microsoft.com/office/word/2016/wordml/cid" xmlns:w16="http://schemas.microsoft.com/office/word/2018/wordml" xmlns:w16du="http://schemas.microsoft.com/office/word/2023/wordml/word16du" xmlns:w16sdtdh="http://schemas.microsoft.com/office/word/2020/wordml/sdtdatahash" xmlns:w16sdtfl="http://schemas.microsoft.com/office/word/2024/wordml/sdtformatlock" xmlns:w16se="http://schemas.microsoft.com/office/word/2015/wordml/symex" xmlns:wpg="http://schemas.microsoft.com/office/word/2010/wordprocessingGroup" xmlns:wpi="http://schemas.microsoft.com/office/word/2010/wordprocessingInk" xmlns:wne="http://schemas.microsoft.com/office/word/2006/wordml" xmlns:wps="http://schemas.microsoft.com/office/word/2010/wordprocessingShape" mc:Ignorable="w14 w15 w16se w16cid w16 w16cex w16sdtdh w16sdtfl w16du wp14">
-  <w:p>
-    <w:pPr>
-      <w:pStyle w:val="Header"/>
-      <w:spacing w:before="240" w:after="240"/>
-    </w:pPr>
-    <w:r>
-      <w:rPr>
-        <w:noProof/>
-      </w:rPr>
-      <w:drawing>
-        <wp:anchor distT="0" distB="0" distL="114300" distR="114300" simplePos="0" relativeHeight="251662336" behindDoc="0" locked="0" layoutInCell="1" allowOverlap="1" wp14:anchorId="65F64BC7" wp14:editId="5780CFE0">
-          <wp:simplePos x="0" y="0"/>
-          <wp:positionH relativeFrom="column">
-            <wp:posOffset>-426914</wp:posOffset>
-          </wp:positionH>
-          <wp:positionV relativeFrom="paragraph">
-            <wp:posOffset>-57150</wp:posOffset>
-          </wp:positionV>
-          <wp:extent cx="969645" cy="1076960"/>
-          <wp:effectExtent l="0" t="0" r="0" b="0"/>
-          <wp:wrapNone/>
-          <wp:docPr id="844590738" name="Picture 1" descr="A computer screen shot of a logo&#10;&#10;Description automatically generated"/>
-          <wp:cNvGraphicFramePr>
-            <a:graphicFrameLocks xmlns:a="http://schemas.openxmlformats.org/drawingml/2006/main" noChangeAspect="1"/>
-          </wp:cNvGraphicFramePr>
-          <a:graphic xmlns:a="http://schemas.openxmlformats.org/drawingml/2006/main">
-            <a:graphicData uri="http://schemas.openxmlformats.org/drawingml/2006/picture">
-              <pic:pic xmlns:pic="http://schemas.openxmlformats.org/drawingml/2006/picture">
-                <pic:nvPicPr>
-                  <pic:cNvPr id="2104333101" name="Picture 1" descr="A computer screen shot of a logo&#10;&#10;Description automatically generated"/>
-                  <pic:cNvPicPr>
-                    <a:picLocks noChangeAspect="1" noChangeArrowheads="1"/>
-                  </pic:cNvPicPr>
-                </pic:nvPicPr>
-                <pic:blipFill>
-                  <a:blip r:embed="rId1">
-                    <a:extLst>
-                      <a:ext uri="{28A0092B-C50C-407E-A947-70E740481C1C}">
-                        <a14:useLocalDpi xmlns:a14="http://schemas.microsoft.com/office/drawing/2010/main" val="0"/>
-                      </a:ext>
-                    </a:extLst>
-                  </a:blip>
-                  <a:srcRect l="41176" t="41138" r="41830" b="25377"/>
-                  <a:stretch>
-                    <a:fillRect/>
-                  </a:stretch>
-                </pic:blipFill>
-                <pic:spPr bwMode="auto">
-                  <a:xfrm>
-                    <a:off x="0" y="0"/>
-                    <a:ext cx="969645" cy="1076960"/>
-                  </a:xfrm>
-                  <a:prstGeom prst="rect">
-                    <a:avLst/>
-                  </a:prstGeom>
-                  <a:noFill/>
-                  <a:ln>
-                    <a:noFill/>
-                  </a:ln>
-                </pic:spPr>
-              </pic:pic>
-            </a:graphicData>
-          </a:graphic>
-          <wp14:sizeRelH relativeFrom="page">
-            <wp14:pctWidth>0</wp14:pctWidth>
-          </wp14:sizeRelH>
-          <wp14:sizeRelV relativeFrom="page">
-            <wp14:pctHeight>0</wp14:pctHeight>
-          </wp14:sizeRelV>
-        </wp:anchor>
-      </w:drawing>
-    </w:r>
-    <w:r>
-      <w:rPr>
-        <w:noProof/>
-      </w:rPr>
-      <mc:AlternateContent>
-        <mc:Choice Requires="wps">
-          <w:drawing>
-            <wp:anchor distT="0" distB="0" distL="114300" distR="114300" simplePos="0" relativeHeight="251660288" behindDoc="0" locked="0" layoutInCell="1" allowOverlap="1" wp14:anchorId="0B22AC2F" wp14:editId="551F8506">
-              <wp:simplePos x="0" y="0"/>
-              <wp:positionH relativeFrom="column">
-                <wp:posOffset>490026</wp:posOffset>
-              </wp:positionH>
-              <wp:positionV relativeFrom="paragraph">
-                <wp:posOffset>13169</wp:posOffset>
-              </wp:positionV>
-              <wp:extent cx="3730625" cy="1003300"/>
-              <wp:effectExtent l="0" t="0" r="0" b="0"/>
-              <wp:wrapNone/>
-              <wp:docPr id="8" name="Text Box 2"/>
-              <wp:cNvGraphicFramePr>
-                <a:graphicFrameLocks xmlns:a="http://schemas.openxmlformats.org/drawingml/2006/main"/>
-              </wp:cNvGraphicFramePr>
-              <a:graphic xmlns:a="http://schemas.openxmlformats.org/drawingml/2006/main">
-                <a:graphicData uri="http://schemas.microsoft.com/office/word/2010/wordprocessingShape">
-                  <wps:wsp>
-                    <wps:cNvSpPr txBox="1">
-                      <a:spLocks noChangeArrowheads="1"/>
-                    </wps:cNvSpPr>
-                    <wps:spPr bwMode="auto">
-                      <a:xfrm>
-                        <a:off x="0" y="0"/>
-                        <a:ext cx="3730625" cy="1003300"/>
-                      </a:xfrm>
-                      <a:prstGeom prst="rect">
-                        <a:avLst/>
-                      </a:prstGeom>
-                      <a:solidFill>
-                        <a:srgbClr val="FFFFFF"/>
-                      </a:solidFill>
-                      <a:ln>
+<w:hdr xmlns:wpc="http://schemas.microsoft.com/office/word/2010/wordprocessingCanvas" xmlns:cx="http://schemas.microsoft.com/office/drawing/2014/chartex" xmlns:cx1="http://schemas.microsoft.com/office/drawing/2015/9/8/chartex" xmlns:cx2="http://schemas.microsoft.com/office/drawing/2015/10/21/chartex" xmlns:cx3="http://schemas.microsoft.com/office/drawing/2016/5/9/chartex" xmlns:cx4="http://schemas.microsoft.com/office/drawing/2016/5/10/chartex" xmlns:cx5="http://schemas.microsoft.com/office/drawing/2016/5/11/chartex" xmlns:cx6="http://schemas.microsoft.com/office/drawing/2016/5/12/chartex" xmlns:cx7="http://schemas.microsoft.com/office/drawing/2016/5/13/chartex" xmlns:cx8="http://schemas.microsoft.com/office/drawing/2016/5/14/chartex" xmlns:mc="http://schemas.openxmlformats.org/markup-compatibility/2006" xmlns:aink="http://schemas.microsoft.com/office/drawing/2016/ink" xmlns:am3d="http://schemas.microsoft.com/office/drawing/2017/model3d" xmlns:o="urn:schemas-microsoft-com:office:office" xmlns:oel="http://schemas.microsoft.com/office/2019/extlst" xmlns:r="http://schemas.openxmlformats.org/officeDocument/2006/relationships" xmlns:m="http://schemas.openxmlformats.org/officeDocument/2006/math" xmlns:v="urn:schemas-microsoft-com:vml" xmlns:wp14="http://schemas.microsoft.com/office/word/2010/wordprocessingDrawing" xmlns:wp="http://schemas.openxmlformats.org/drawingml/2006/wordprocessingDrawing" xmlns:w10="urn:schemas-microsoft-com:office:word" xmlns:w="http://schemas.openxmlformats.org/wordprocessingml/2006/main" xmlns:w14="http://schemas.microsoft.com/office/word/2010/wordml" xmlns:w15="http://schemas.microsoft.com/office/word/2012/wordml" xmlns:w16cex="http://schemas.microsoft.com/office/word/2018/wordml/cex" xmlns:w16cid="http://schemas.microsoft.com/office/word/2016/wordml/cid" xmlns:w16="http://schemas.microsoft.com/office/word/2018/wordml" xmlns:w16du="http://schemas.microsoft.com/office/word/2023/wordml/word16du" xmlns:w16sdtdh="http://schemas.microsoft.com/office/word/2020/wordml/sdtdatahash" xmlns:w16sdtfl="http://schemas.microsoft.com/office/word/2024/wordml/sdtformatlock" xmlns:w16se="http://schemas.microsoft.com/office/word/2015/wordml/symex" xmlns:wpg="http://schemas.microsoft.com/office/word/2010/wordprocessingGroup" xmlns:wpi="http://schemas.microsoft.com/office/word/2010/wordprocessingInk" xmlns:wne="http://schemas.microsoft.com/office/word/2006/wordml" xmlns:wps="http://schemas.microsoft.com/office/word/2010/wordprocessingShape" mc:Ignorable="w14 w15 w16se w16cid w16 w16cex w16sdtdh w16sdtfl w16du wp14">
+  <w:tbl>
+    <w:tblPr>
+      <w:tblStyle w:val="TableGrid1"/>
+      <w:tblW w:w="11314" w:type="dxa"/>
+      <w:tblInd w:w="-1134" w:type="dxa"/>
+      <w:tblBorders>
+        <w:top w:val="none" w:sz="0" w:space="0" w:color="auto"/>
+        <w:left w:val="none" w:sz="0" w:space="0" w:color="auto"/>
+        <w:bottom w:val="none" w:sz="0" w:space="0" w:color="auto"/>
+        <w:right w:val="none" w:sz="0" w:space="0" w:color="auto"/>
+        <w:insideH w:val="none" w:sz="0" w:space="0" w:color="auto"/>
+        <w:insideV w:val="none" w:sz="0" w:space="0" w:color="auto"/>
+      </w:tblBorders>
+      <w:tblLook w:val="04A0" w:firstRow="1" w:lastRow="0" w:firstColumn="1" w:lastColumn="0" w:noHBand="0" w:noVBand="1"/>
+    </w:tblPr>
+    <w:tblGrid>
+      <w:gridCol w:w="1611"/>
+      <w:gridCol w:w="5907"/>
+      <w:gridCol w:w="3796"/>
+    </w:tblGrid>
+    <w:tr>
+      <w:tc>
+        <w:tcPr>
+          <w:tcW w:w="1611" w:type="dxa"/>
+          <w:hideMark/>
+        </w:tcPr>
+        <w:p>
+          <w:pPr>
+            <w:tabs>
+              <w:tab w:val="center" w:pos="4680"/>
+              <w:tab w:val="right" w:pos="9360"/>
+            </w:tabs>
+            <w:spacing w:before="240" w:after="240"/>
+            <w:jc w:val="center"/>
+          </w:pPr>
+          <w:bookmarkStart w:id="0" w:name="_Hlk184387129"/>
+          <w:bookmarkStart w:id="1" w:name="_Hlk184387130"/>
+          <w:r>
+            <w:rPr>
+              <w:noProof/>
+            </w:rPr>
+            <w:drawing>
+              <wp:inline distT="0" distB="0" distL="0" distR="0" wp14:anchorId="2408024E" wp14:editId="624D2215">
+                <wp:extent cx="876300" cy="986155"/>
+                <wp:effectExtent l="0" t="0" r="0" b="4445"/>
+                <wp:docPr id="5" name="Picture 1"/>
+                <wp:cNvGraphicFramePr>
+                  <a:graphicFrameLocks xmlns:a="http://schemas.openxmlformats.org/drawingml/2006/main" noChangeAspect="1"/>
+                </wp:cNvGraphicFramePr>
+                <a:graphic xmlns:a="http://schemas.openxmlformats.org/drawingml/2006/main">
+                  <a:graphicData uri="http://schemas.openxmlformats.org/drawingml/2006/picture">
+                    <pic:pic xmlns:pic="http://schemas.openxmlformats.org/drawingml/2006/picture">
+                      <pic:nvPicPr>
+                        <pic:cNvPr id="0" name="Picture 1"/>
+                        <pic:cNvPicPr>
+                          <a:picLocks noChangeAspect="1" noChangeArrowheads="1"/>
+                        </pic:cNvPicPr>
+                      </pic:nvPicPr>
+                      <pic:blipFill>
+                        <a:blip r:embed="rId1">
+                          <a:extLst>
+                            <a:ext uri="{28A0092B-C50C-407E-A947-70E740481C1C}">
+                              <a14:useLocalDpi xmlns:a14="http://schemas.microsoft.com/office/drawing/2010/main" val="0"/>
+                            </a:ext>
+                          </a:extLst>
+                        </a:blip>
+                        <a:srcRect l="41176" t="41138" r="41830" b="25377"/>
+                        <a:stretch>
+                          <a:fillRect/>
+                        </a:stretch>
+                      </pic:blipFill>
+                      <pic:spPr bwMode="auto">
+                        <a:xfrm>
+                          <a:off x="0" y="0"/>
+                          <a:ext cx="876300" cy="986155"/>
+                        </a:xfrm>
+                        <a:prstGeom prst="rect">
+                          <a:avLst/>
+                        </a:prstGeom>
                         <a:noFill/>
-                      </a:ln>
-                    </wps:spPr>
-                    <wps:txbx>
-                      <w:txbxContent>
-                        <w:p>
-                          <w:pPr>
-                            <w:spacing w:after="0" w:line="240" w:lineRule="auto"/>
-                            <w:rPr>
-                              <w:rFonts w:ascii="Times New Roman" w:hAnsi="Times New Roman"/>
-                              <w:b/>
-                              <w:color w:val="0070C0"/>
-                            </w:rPr>
-                          </w:pPr>
-                          <w:r>
-                            <w:rPr>
-                              <w:rFonts w:ascii="Times New Roman" w:hAnsi="Times New Roman"/>
-                              <w:b/>
-                              <w:color w:val="0070C0"/>
-                            </w:rPr>
-                            <w:t>KEMENTERIAN PENDIDIKAN TINGGI, SAIN</w:t>
-                          </w:r>
-                          <w:r>
-                            <w:rPr>
-                              <w:rFonts w:ascii="Times New Roman" w:hAnsi="Times New Roman"/>
-                              <w:b/>
-                              <w:color w:val="0070C0"/>
-                            </w:rPr>
-                            <w:t>S</w:t>
-                          </w:r>
-                          <w:r>
-                            <w:rPr>
-                              <w:rFonts w:ascii="Times New Roman" w:hAnsi="Times New Roman"/>
-                              <w:b/>
-                              <w:color w:val="0070C0"/>
-                            </w:rPr>
-                            <w:t>,</w:t>
-                          </w:r>
-                        </w:p>
-                        <w:p>
-                          <w:pPr>
-                            <w:spacing w:after="0" w:line="240" w:lineRule="auto"/>
-                            <w:rPr>
-                              <w:rFonts w:ascii="Times New Roman" w:hAnsi="Times New Roman"/>
-                              <w:b/>
-                              <w:color w:val="0070C0"/>
-                            </w:rPr>
-                          </w:pPr>
-                          <w:r>
-                            <w:rPr>
-                              <w:rFonts w:ascii="Times New Roman" w:hAnsi="Times New Roman"/>
-                              <w:b/>
-                              <w:color w:val="0070C0"/>
-                            </w:rPr>
-                            <w:t>DAN TEKNOLOGI</w:t>
-                          </w:r>
-                        </w:p>
-                        <w:p>
-                          <w:pPr>
-                            <w:spacing w:after="0" w:line="240" w:lineRule="auto"/>
-                            <w:rPr>
-                              <w:rFonts w:ascii="Times New Roman" w:hAnsi="Times New Roman"/>
-                              <w:b/>
-                              <w:color w:val="0070C0"/>
-                              <w:sz w:val="24"/>
-                              <w:szCs w:val="24"/>
-                            </w:rPr>
-                          </w:pPr>
-                          <w:r>
-                            <w:rPr>
-                              <w:rFonts w:ascii="Times New Roman" w:hAnsi="Times New Roman"/>
-                              <w:b/>
-                              <w:color w:val="0070C0"/>
-                              <w:sz w:val="24"/>
-                              <w:szCs w:val="24"/>
-                            </w:rPr>
-                            <w:t>UNIVERSITAS</w:t>
-                          </w:r>
-                          <w:r>
-                            <w:rPr>
-                              <w:rFonts w:ascii="Times New Roman" w:hAnsi="Times New Roman"/>
-                              <w:b/>
-                              <w:color w:val="0070C0"/>
-                              <w:sz w:val="24"/>
-                              <w:szCs w:val="24"/>
-                            </w:rPr>
-                            <w:t xml:space="preserve"> </w:t>
-                          </w:r>
-                          <w:r>
-                            <w:rPr>
-                              <w:rFonts w:ascii="Times New Roman" w:hAnsi="Times New Roman"/>
-                              <w:b/>
-                              <w:color w:val="0070C0"/>
-                              <w:sz w:val="24"/>
-                              <w:szCs w:val="24"/>
-                            </w:rPr>
-                            <w:t>DIPONEGORO</w:t>
-                          </w:r>
-                        </w:p>
-                        <w:p>
-                          <w:pPr>
-                            <w:spacing w:after="0" w:line="240" w:lineRule="auto"/>
-                            <w:rPr>
-                              <w:rFonts w:ascii="Times New Roman" w:hAnsi="Times New Roman"/>
-                              <w:b/>
-                              <w:color w:val="0070C0"/>
-                              <w:sz w:val="24"/>
-                              <w:szCs w:val="24"/>
-                            </w:rPr>
-                          </w:pPr>
-                          <w:r>
-                            <w:rPr>
-                              <w:rFonts w:ascii="Times New Roman" w:hAnsi="Times New Roman"/>
-                              <w:b/>
-                              <w:color w:val="0070C0"/>
-                              <w:sz w:val="24"/>
-                              <w:szCs w:val="24"/>
-                            </w:rPr>
-                            <w:t>FAKULTAS TEKNIK</w:t>
-                          </w:r>
-                        </w:p>
-                        <w:p>
-                          <w:pPr>
-                            <w:spacing w:after="0" w:line="240" w:lineRule="auto"/>
-                            <w:rPr>
-                              <w:rFonts w:ascii="Times New Roman" w:hAnsi="Times New Roman"/>
-                              <w:b/>
-                              <w:color w:val="0070C0"/>
-                              <w:sz w:val="30"/>
-                              <w:szCs w:val="30"/>
-                            </w:rPr>
-                          </w:pPr>
-                          <w:r>
-                            <w:rPr>
-                              <w:rFonts w:ascii="Times New Roman" w:hAnsi="Times New Roman"/>
-                              <w:b/>
-                              <w:color w:val="0070C0"/>
-                              <w:sz w:val="30"/>
-                              <w:szCs w:val="30"/>
-                            </w:rPr>
-                            <w:t>DEPARTEMEN TEKNIK</w:t>
-                          </w:r>
-                          <w:r>
-                            <w:rPr>
-                              <w:rFonts w:ascii="Times New Roman" w:hAnsi="Times New Roman"/>
-                              <w:b/>
-                              <w:color w:val="0070C0"/>
-                              <w:sz w:val="30"/>
-                              <w:szCs w:val="30"/>
-                            </w:rPr>
-                            <w:t xml:space="preserve"> LI</w:t>
-                          </w:r>
-                          <w:r>
-                            <w:rPr>
-                              <w:rFonts w:ascii="Times New Roman" w:hAnsi="Times New Roman"/>
-                              <w:b/>
-                              <w:color w:val="0070C0"/>
-                              <w:sz w:val="30"/>
-                              <w:szCs w:val="30"/>
-                            </w:rPr>
-                            <w:t>NGKUNGAN</w:t>
-                          </w:r>
-                        </w:p>
-                      </w:txbxContent>
-                    </wps:txbx>
-                    <wps:bodyPr rot="0" vert="horz" wrap="square" lIns="91440" tIns="45720" rIns="91440" bIns="45720" anchor="t" anchorCtr="0" upright="1">
-                      <a:noAutofit/>
-                    </wps:bodyPr>
-                  </wps:wsp>
-                </a:graphicData>
-              </a:graphic>
-              <wp14:sizeRelH relativeFrom="margin">
-                <wp14:pctWidth>0</wp14:pctWidth>
-              </wp14:sizeRelH>
-              <wp14:sizeRelV relativeFrom="margin">
-                <wp14:pctHeight>0</wp14:pctHeight>
-              </wp14:sizeRelV>
-            </wp:anchor>
-          </w:drawing>
-        </mc:Choice>
-        <mc:Fallback>
-          <w:pict>
-            <v:shapetype w14:anchorId="0B22AC2F" id="_x0000_t202" coordsize="21600,21600" o:spt="202" path="m,l,21600r21600,l21600,xe">
-              <v:stroke joinstyle="miter"/>
-              <v:path gradientshapeok="t" o:connecttype="rect"/>
-            </v:shapetype>
-            <v:shape id="Text Box 2" o:spid="_x0000_s1026" type="#_x0000_t202" style="position:absolute;margin-left:38.6pt;margin-top:1.05pt;width:293.75pt;height:79pt;z-index:251660288;visibility:visible;mso-wrap-style:square;mso-width-percent:0;mso-height-percent:0;mso-wrap-distance-left:9pt;mso-wrap-distance-top:0;mso-wrap-distance-right:9pt;mso-wrap-distance-bottom:0;mso-position-horizontal:absolute;mso-position-horizontal-relative:text;mso-position-vertical:absolute;mso-position-vertical-relative:text;mso-width-percent:0;mso-height-percent:0;mso-width-relative:margin;mso-height-relative:margin;v-text-anchor:top" o:gfxdata="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" stroked="f">
-              <v:textbox>
-                <w:txbxContent>
-                  <w:p>
-                    <w:pPr>
-                      <w:spacing w:after="0" w:line="240" w:lineRule="auto"/>
-                      <w:rPr>
-                        <w:rFonts w:ascii="Times New Roman" w:hAnsi="Times New Roman"/>
-                        <w:b/>
-                        <w:color w:val="0070C0"/>
-                      </w:rPr>
-                    </w:pPr>
-                    <w:r>
-                      <w:rPr>
-                        <w:rFonts w:ascii="Times New Roman" w:hAnsi="Times New Roman"/>
-                        <w:b/>
-                        <w:color w:val="0070C0"/>
-                      </w:rPr>
-                      <w:t>KEMENTERIAN PENDIDIKAN TINGGI, SAIN</w:t>
-                    </w:r>
-                    <w:r>
-                      <w:rPr>
-                        <w:rFonts w:ascii="Times New Roman" w:hAnsi="Times New Roman"/>
-                        <w:b/>
-                        <w:color w:val="0070C0"/>
-                      </w:rPr>
-                      <w:t>S</w:t>
-                    </w:r>
-                    <w:r>
-                      <w:rPr>
-                        <w:rFonts w:ascii="Times New Roman" w:hAnsi="Times New Roman"/>
-                        <w:b/>
-                        <w:color w:val="0070C0"/>
-                      </w:rPr>
-                      <w:t>,</w:t>
-                    </w:r>
-                  </w:p>
-                  <w:p>
-                    <w:pPr>
-                      <w:spacing w:after="0" w:line="240" w:lineRule="auto"/>
-                      <w:rPr>
-                        <w:rFonts w:ascii="Times New Roman" w:hAnsi="Times New Roman"/>
-                        <w:b/>
-                        <w:color w:val="0070C0"/>
-                      </w:rPr>
-                    </w:pPr>
-                    <w:r>
-                      <w:rPr>
-                        <w:rFonts w:ascii="Times New Roman" w:hAnsi="Times New Roman"/>
-                        <w:b/>
-                        <w:color w:val="0070C0"/>
-                      </w:rPr>
-                      <w:t>DAN TEKNOLOGI</w:t>
-                    </w:r>
-                  </w:p>
-                  <w:p>
-                    <w:pPr>
-                      <w:spacing w:after="0" w:line="240" w:lineRule="auto"/>
-                      <w:rPr>
-                        <w:rFonts w:ascii="Times New Roman" w:hAnsi="Times New Roman"/>
-                        <w:b/>
-                        <w:color w:val="0070C0"/>
-                        <w:sz w:val="24"/>
-                        <w:szCs w:val="24"/>
-                      </w:rPr>
-                    </w:pPr>
-                    <w:r>
-                      <w:rPr>
-                        <w:rFonts w:ascii="Times New Roman" w:hAnsi="Times New Roman"/>
-                        <w:b/>
-                        <w:color w:val="0070C0"/>
-                        <w:sz w:val="24"/>
-                        <w:szCs w:val="24"/>
-                      </w:rPr>
-                      <w:t>UNIVERSITAS</w:t>
-                    </w:r>
-                    <w:r>
-                      <w:rPr>
-                        <w:rFonts w:ascii="Times New Roman" w:hAnsi="Times New Roman"/>
-                        <w:b/>
-                        <w:color w:val="0070C0"/>
-                        <w:sz w:val="24"/>
-                        <w:szCs w:val="24"/>
-                      </w:rPr>
-                      <w:t xml:space="preserve"> </w:t>
-                    </w:r>
-                    <w:r>
-                      <w:rPr>
-                        <w:rFonts w:ascii="Times New Roman" w:hAnsi="Times New Roman"/>
-                        <w:b/>
-                        <w:color w:val="0070C0"/>
-                        <w:sz w:val="24"/>
-                        <w:szCs w:val="24"/>
-                      </w:rPr>
-                      <w:t>DIPONEGORO</w:t>
-                    </w:r>
-                  </w:p>
-                  <w:p>
-                    <w:pPr>
-                      <w:spacing w:after="0" w:line="240" w:lineRule="auto"/>
-                      <w:rPr>
-                        <w:rFonts w:ascii="Times New Roman" w:hAnsi="Times New Roman"/>
-                        <w:b/>
-                        <w:color w:val="0070C0"/>
-                        <w:sz w:val="24"/>
-                        <w:szCs w:val="24"/>
-                      </w:rPr>
-                    </w:pPr>
-                    <w:r>
-                      <w:rPr>
-                        <w:rFonts w:ascii="Times New Roman" w:hAnsi="Times New Roman"/>
-                        <w:b/>
-                        <w:color w:val="0070C0"/>
-                        <w:sz w:val="24"/>
-                        <w:szCs w:val="24"/>
-                      </w:rPr>
-                      <w:t>FAKULTAS TEKNIK</w:t>
-                    </w:r>
-                  </w:p>
-                  <w:p>
-                    <w:pPr>
-                      <w:spacing w:after="0" w:line="240" w:lineRule="auto"/>
-                      <w:rPr>
-                        <w:rFonts w:ascii="Times New Roman" w:hAnsi="Times New Roman"/>
-                        <w:b/>
-                        <w:color w:val="0070C0"/>
-                        <w:sz w:val="30"/>
-                        <w:szCs w:val="30"/>
-                      </w:rPr>
-                    </w:pPr>
-                    <w:r>
-                      <w:rPr>
-                        <w:rFonts w:ascii="Times New Roman" w:hAnsi="Times New Roman"/>
-                        <w:b/>
-                        <w:color w:val="0070C0"/>
-                        <w:sz w:val="30"/>
-                        <w:szCs w:val="30"/>
-                      </w:rPr>
-                      <w:t>DEPARTEMEN TEKNIK</w:t>
-                    </w:r>
-                    <w:r>
-                      <w:rPr>
-                        <w:rFonts w:ascii="Times New Roman" w:hAnsi="Times New Roman"/>
-                        <w:b/>
-                        <w:color w:val="0070C0"/>
-                        <w:sz w:val="30"/>
-                        <w:szCs w:val="30"/>
-                      </w:rPr>
-                      <w:t xml:space="preserve"> LI</w:t>
-                    </w:r>
-                    <w:r>
-                      <w:rPr>
-                        <w:rFonts w:ascii="Times New Roman" w:hAnsi="Times New Roman"/>
-                        <w:b/>
-                        <w:color w:val="0070C0"/>
-                        <w:sz w:val="30"/>
-                        <w:szCs w:val="30"/>
-                      </w:rPr>
-                      <w:t>NGKUNGAN</w:t>
-                    </w:r>
-                  </w:p>
-                </w:txbxContent>
-              </v:textbox>
-            </v:shape>
-          </w:pict>
-        </mc:Fallback>
-      </mc:AlternateContent>
-    </w:r>
-    <w:r>
-      <w:rPr>
-        <w:noProof/>
-      </w:rPr>
-      <mc:AlternateContent>
-        <mc:Choice Requires="wps">
-          <w:drawing>
-            <wp:anchor distT="0" distB="0" distL="114300" distR="114300" simplePos="0" relativeHeight="251661312" behindDoc="0" locked="0" layoutInCell="1" allowOverlap="1" wp14:anchorId="4C343A8D" wp14:editId="1D3F400E">
-              <wp:simplePos x="0" y="0"/>
-              <wp:positionH relativeFrom="column">
-                <wp:posOffset>4142519</wp:posOffset>
-              </wp:positionH>
-              <wp:positionV relativeFrom="paragraph">
-                <wp:posOffset>286579</wp:posOffset>
-              </wp:positionV>
-              <wp:extent cx="2524125" cy="650240"/>
-              <wp:effectExtent l="0" t="0" r="0" b="0"/>
-              <wp:wrapNone/>
-              <wp:docPr id="7" name="Text Box 4"/>
-              <wp:cNvGraphicFramePr>
-                <a:graphicFrameLocks xmlns:a="http://schemas.openxmlformats.org/drawingml/2006/main"/>
-              </wp:cNvGraphicFramePr>
-              <a:graphic xmlns:a="http://schemas.openxmlformats.org/drawingml/2006/main">
-                <a:graphicData uri="http://schemas.microsoft.com/office/word/2010/wordprocessingShape">
-                  <wps:wsp>
-                    <wps:cNvSpPr txBox="1">
-                      <a:spLocks noChangeArrowheads="1"/>
-                    </wps:cNvSpPr>
-                    <wps:spPr bwMode="auto">
-                      <a:xfrm>
-                        <a:off x="0" y="0"/>
-                        <a:ext cx="2524125" cy="650240"/>
-                      </a:xfrm>
-                      <a:prstGeom prst="rect">
-                        <a:avLst/>
-                      </a:prstGeom>
-                      <a:solidFill>
-                        <a:srgbClr val="FFFFFF"/>
-                      </a:solidFill>
-                      <a:ln>
-                        <a:noFill/>
-                      </a:ln>
-                    </wps:spPr>
-                    <wps:txbx>
-                      <w:txbxContent>
-                        <w:p>
-                          <w:pPr>
-                            <w:spacing w:after="0" w:line="240" w:lineRule="auto"/>
-                            <w:jc w:val="right"/>
-                            <w:rPr>
-                              <w:rFonts w:ascii="Times New Roman" w:hAnsi="Times New Roman"/>
-                              <w:color w:val="0070C0"/>
-                              <w:sz w:val="18"/>
-                              <w:szCs w:val="18"/>
-                            </w:rPr>
-                          </w:pPr>
-                          <w:r>
-                            <w:rPr>
-                              <w:rFonts w:ascii="Times New Roman" w:hAnsi="Times New Roman"/>
-                              <w:color w:val="0070C0"/>
-                              <w:sz w:val="18"/>
-                              <w:szCs w:val="18"/>
-                            </w:rPr>
-                            <w:t>Jalan Prof. Sudarto, S.H.</w:t>
-                          </w:r>
-                        </w:p>
-                        <w:p>
-                          <w:pPr>
-                            <w:spacing w:after="0" w:line="240" w:lineRule="auto"/>
-                            <w:jc w:val="right"/>
-                            <w:rPr>
-                              <w:rFonts w:ascii="Times New Roman" w:hAnsi="Times New Roman"/>
-                              <w:color w:val="0070C0"/>
-                              <w:sz w:val="18"/>
-                              <w:szCs w:val="18"/>
-                            </w:rPr>
-                          </w:pPr>
-                          <w:r>
-                            <w:rPr>
-                              <w:rFonts w:ascii="Times New Roman" w:hAnsi="Times New Roman"/>
-                              <w:color w:val="0070C0"/>
-                              <w:sz w:val="18"/>
-                              <w:szCs w:val="18"/>
-                            </w:rPr>
-                            <w:t>Tembalang Semarang Kode Pos 50275</w:t>
-                          </w:r>
-                        </w:p>
-                        <w:p>
-                          <w:pPr>
-                            <w:spacing w:after="0" w:line="240" w:lineRule="auto"/>
-                            <w:jc w:val="right"/>
-                            <w:rPr>
-                              <w:rFonts w:ascii="Times New Roman" w:hAnsi="Times New Roman"/>
-                              <w:color w:val="0070C0"/>
-                              <w:sz w:val="18"/>
-                              <w:szCs w:val="18"/>
-                            </w:rPr>
-                          </w:pPr>
-                          <w:r>
-                            <w:rPr>
-                              <w:rFonts w:ascii="Times New Roman" w:hAnsi="Times New Roman"/>
-                              <w:color w:val="0070C0"/>
-                              <w:sz w:val="18"/>
-                              <w:szCs w:val="18"/>
-                            </w:rPr>
-                            <w:t>Tel. (024) 76480678, Faks. (024) 7460053</w:t>
-                          </w:r>
-                        </w:p>
-                        <w:p>
-                          <w:pPr>
-                            <w:spacing w:after="0" w:line="240" w:lineRule="auto"/>
-                            <w:rPr>
-                              <w:rFonts w:ascii="Times New Roman" w:hAnsi="Times New Roman"/>
-                              <w:color w:val="0070C0"/>
-                              <w:sz w:val="18"/>
-                              <w:szCs w:val="18"/>
-                            </w:rPr>
-                          </w:pPr>
-                          <w:hyperlink r:id="rId2" w:history="1">
-                            <w:r>
-                              <w:rPr>
-                                <w:rFonts w:ascii="Times New Roman" w:hAnsi="Times New Roman"/>
-                                <w:color w:val="0070C0"/>
-                                <w:sz w:val="18"/>
-                                <w:szCs w:val="18"/>
-                              </w:rPr>
-                              <w:t>www.ft.undip.ac.id</w:t>
-                            </w:r>
-                          </w:hyperlink>
-                          <w:r>
-                            <w:rPr>
-                              <w:rFonts w:ascii="Times New Roman" w:hAnsi="Times New Roman"/>
-                              <w:color w:val="0070C0"/>
-                              <w:sz w:val="18"/>
-                              <w:szCs w:val="18"/>
-                            </w:rPr>
-                            <w:t xml:space="preserve"> email:</w:t>
-                          </w:r>
-                          <w:r>
-                            <w:rPr>
-                              <w:rFonts w:ascii="Times New Roman" w:hAnsi="Times New Roman"/>
-                              <w:color w:val="0070C0"/>
-                              <w:sz w:val="18"/>
-                              <w:szCs w:val="18"/>
-                            </w:rPr>
-                            <w:t>e</w:t>
-                          </w:r>
-                          <w:r>
-                            <w:rPr>
-                              <w:rFonts w:ascii="Times New Roman" w:hAnsi="Times New Roman"/>
-                              <w:color w:val="0070C0"/>
-                              <w:sz w:val="18"/>
-                              <w:szCs w:val="18"/>
-                            </w:rPr>
-                            <w:t>nveng@live.undip.ac.id</w:t>
-                          </w:r>
-                        </w:p>
-                        <w:p>
-                          <w:pPr>
-                            <w:spacing w:after="0" w:line="240" w:lineRule="auto"/>
-                            <w:jc w:val="right"/>
-                            <w:rPr>
-                              <w:rFonts w:ascii="Times New Roman" w:hAnsi="Times New Roman"/>
-                              <w:color w:val="0070C0"/>
-                              <w:sz w:val="18"/>
-                              <w:szCs w:val="18"/>
-                            </w:rPr>
-                          </w:pPr>
-                        </w:p>
-                      </w:txbxContent>
-                    </wps:txbx>
-                    <wps:bodyPr rot="0" vert="horz" wrap="square" lIns="91440" tIns="45720" rIns="91440" bIns="45720" anchor="t" anchorCtr="0" upright="1">
-                      <a:noAutofit/>
-                    </wps:bodyPr>
-                  </wps:wsp>
-                </a:graphicData>
-              </a:graphic>
-              <wp14:sizeRelH relativeFrom="margin">
-                <wp14:pctWidth>0</wp14:pctWidth>
-              </wp14:sizeRelH>
-              <wp14:sizeRelV relativeFrom="margin">
-                <wp14:pctHeight>0</wp14:pctHeight>
-              </wp14:sizeRelV>
-            </wp:anchor>
-          </w:drawing>
-        </mc:Choice>
-        <mc:Fallback>
-          <w:pict>
-            <v:shape w14:anchorId="4C343A8D" id="Text Box 4" o:spid="_x0000_s1027" type="#_x0000_t202" style="position:absolute;margin-left:326.2pt;margin-top:22.55pt;width:198.75pt;height:51.2pt;z-index:251661312;visibility:visible;mso-wrap-style:square;mso-width-percent:0;mso-height-percent:0;mso-wrap-distance-left:9pt;mso-wrap-distance-top:0;mso-wrap-distance-right:9pt;mso-wrap-distance-bottom:0;mso-position-horizontal:absolute;mso-position-horizontal-relative:text;mso-position-vertical:absolute;mso-position-vertical-relative:text;mso-width-percent:0;mso-height-percent:0;mso-width-relative:margin;mso-height-relative:margin;v-text-anchor:top" o:gfxdata="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" stroked="f">
-              <v:textbox>
-                <w:txbxContent>
-                  <w:p>
-                    <w:pPr>
-                      <w:spacing w:after="0" w:line="240" w:lineRule="auto"/>
-                      <w:jc w:val="right"/>
-                      <w:rPr>
-                        <w:rFonts w:ascii="Times New Roman" w:hAnsi="Times New Roman"/>
-                        <w:color w:val="0070C0"/>
-                        <w:sz w:val="18"/>
-                        <w:szCs w:val="18"/>
-                      </w:rPr>
-                    </w:pPr>
-                    <w:r>
-                      <w:rPr>
-                        <w:rFonts w:ascii="Times New Roman" w:hAnsi="Times New Roman"/>
-                        <w:color w:val="0070C0"/>
-                        <w:sz w:val="18"/>
-                        <w:szCs w:val="18"/>
-                      </w:rPr>
-                      <w:t xml:space="preserve">Jalan Prof. </w:t>
-                    </w:r>
-                    <w:proofErr w:type="spellStart"/>
-                    <w:r>
-                      <w:rPr>
-                        <w:rFonts w:ascii="Times New Roman" w:hAnsi="Times New Roman"/>
-                        <w:color w:val="0070C0"/>
-                        <w:sz w:val="18"/>
-                        <w:szCs w:val="18"/>
-                      </w:rPr>
-                      <w:t>Sudarto</w:t>
-                    </w:r>
-                    <w:proofErr w:type="spellEnd"/>
-                    <w:r>
-                      <w:rPr>
-                        <w:rFonts w:ascii="Times New Roman" w:hAnsi="Times New Roman"/>
-                        <w:color w:val="0070C0"/>
-                        <w:sz w:val="18"/>
-                        <w:szCs w:val="18"/>
-                      </w:rPr>
-                      <w:t>, S.H.</w:t>
-                    </w:r>
-                  </w:p>
-                  <w:p>
-                    <w:pPr>
-                      <w:spacing w:after="0" w:line="240" w:lineRule="auto"/>
-                      <w:jc w:val="right"/>
-                      <w:rPr>
-                        <w:rFonts w:ascii="Times New Roman" w:hAnsi="Times New Roman"/>
-                        <w:color w:val="0070C0"/>
-                        <w:sz w:val="18"/>
-                        <w:szCs w:val="18"/>
-                      </w:rPr>
-                    </w:pPr>
-                    <w:proofErr w:type="spellStart"/>
-                    <w:r>
-                      <w:rPr>
-                        <w:rFonts w:ascii="Times New Roman" w:hAnsi="Times New Roman"/>
-                        <w:color w:val="0070C0"/>
-                        <w:sz w:val="18"/>
-                        <w:szCs w:val="18"/>
-                      </w:rPr>
-                      <w:t>Tembalang</w:t>
-                    </w:r>
-                    <w:proofErr w:type="spellEnd"/>
-                    <w:r>
-                      <w:rPr>
-                        <w:rFonts w:ascii="Times New Roman" w:hAnsi="Times New Roman"/>
-                        <w:color w:val="0070C0"/>
-                        <w:sz w:val="18"/>
-                        <w:szCs w:val="18"/>
-                      </w:rPr>
-                      <w:t xml:space="preserve"> Semarang Kode Pos 50275</w:t>
-                    </w:r>
-                  </w:p>
-                  <w:p>
-                    <w:pPr>
-                      <w:spacing w:after="0" w:line="240" w:lineRule="auto"/>
-                      <w:jc w:val="right"/>
-                      <w:rPr>
-                        <w:rFonts w:ascii="Times New Roman" w:hAnsi="Times New Roman"/>
-                        <w:color w:val="0070C0"/>
-                        <w:sz w:val="18"/>
-                        <w:szCs w:val="18"/>
-                      </w:rPr>
-                    </w:pPr>
-                    <w:r>
-                      <w:rPr>
-                        <w:rFonts w:ascii="Times New Roman" w:hAnsi="Times New Roman"/>
-                        <w:color w:val="0070C0"/>
-                        <w:sz w:val="18"/>
-                        <w:szCs w:val="18"/>
-                      </w:rPr>
-                      <w:t xml:space="preserve">Tel. (024) 76480678, </w:t>
-                    </w:r>
-                    <w:proofErr w:type="spellStart"/>
-                    <w:r>
-                      <w:rPr>
-                        <w:rFonts w:ascii="Times New Roman" w:hAnsi="Times New Roman"/>
-                        <w:color w:val="0070C0"/>
-                        <w:sz w:val="18"/>
-                        <w:szCs w:val="18"/>
-                      </w:rPr>
-                      <w:t>Faks</w:t>
-                    </w:r>
-                    <w:proofErr w:type="spellEnd"/>
-                    <w:r>
-                      <w:rPr>
-                        <w:rFonts w:ascii="Times New Roman" w:hAnsi="Times New Roman"/>
-                        <w:color w:val="0070C0"/>
-                        <w:sz w:val="18"/>
-                        <w:szCs w:val="18"/>
-                      </w:rPr>
-                      <w:t>. (024) 7460053</w:t>
-                    </w:r>
-                  </w:p>
-                  <w:p>
-                    <w:pPr>
-                      <w:spacing w:after="0" w:line="240" w:lineRule="auto"/>
-                      <w:rPr>
-                        <w:rFonts w:ascii="Times New Roman" w:hAnsi="Times New Roman"/>
-                        <w:color w:val="0070C0"/>
-                        <w:sz w:val="18"/>
-                        <w:szCs w:val="18"/>
-                      </w:rPr>
-                    </w:pPr>
-                    <w:hyperlink r:id="rId3" w:history="1">
-                      <w:r>
-                        <w:rPr>
-                          <w:rFonts w:ascii="Times New Roman" w:hAnsi="Times New Roman"/>
-                          <w:color w:val="0070C0"/>
-                          <w:sz w:val="18"/>
-                          <w:szCs w:val="18"/>
-                        </w:rPr>
-                        <w:t>www.ft.undip.ac.id</w:t>
-                      </w:r>
-                    </w:hyperlink>
-                    <w:r>
-                      <w:rPr>
-                        <w:rFonts w:ascii="Times New Roman" w:hAnsi="Times New Roman"/>
-                        <w:color w:val="0070C0"/>
-                        <w:sz w:val="18"/>
-                        <w:szCs w:val="18"/>
-                      </w:rPr>
-                      <w:t xml:space="preserve"> </w:t>
-                    </w:r>
-                    <w:proofErr w:type="spellStart"/>
-                    <w:proofErr w:type="gramStart"/>
-                    <w:r>
-                      <w:rPr>
-                        <w:rFonts w:ascii="Times New Roman" w:hAnsi="Times New Roman"/>
-                        <w:color w:val="0070C0"/>
-                        <w:sz w:val="18"/>
-                        <w:szCs w:val="18"/>
-                      </w:rPr>
-                      <w:t>email:</w:t>
-                    </w:r>
-                    <w:r>
-                      <w:rPr>
-                        <w:rFonts w:ascii="Times New Roman" w:hAnsi="Times New Roman"/>
-                        <w:color w:val="0070C0"/>
-                        <w:sz w:val="18"/>
-                        <w:szCs w:val="18"/>
-                      </w:rPr>
-                      <w:t>e</w:t>
-                    </w:r>
-                    <w:r>
-                      <w:rPr>
-                        <w:rFonts w:ascii="Times New Roman" w:hAnsi="Times New Roman"/>
-                        <w:color w:val="0070C0"/>
-                        <w:sz w:val="18"/>
-                        <w:szCs w:val="18"/>
-                      </w:rPr>
-                      <w:t>nveng@live.undip.ac.id</w:t>
-                    </w:r>
-                    <w:proofErr w:type="spellEnd"/>
-                    <w:proofErr w:type="gramEnd"/>
-                  </w:p>
-                  <w:p>
-                    <w:pPr>
-                      <w:spacing w:after="0" w:line="240" w:lineRule="auto"/>
-                      <w:jc w:val="right"/>
-                      <w:rPr>
-                        <w:rFonts w:ascii="Times New Roman" w:hAnsi="Times New Roman"/>
-                        <w:color w:val="0070C0"/>
-                        <w:sz w:val="18"/>
-                        <w:szCs w:val="18"/>
-                      </w:rPr>
-                    </w:pPr>
-                  </w:p>
-                </w:txbxContent>
-              </v:textbox>
-            </v:shape>
-          </w:pict>
-        </mc:Fallback>
-      </mc:AlternateContent>
-    </w:r>
-  </w:p>
-  <w:p>
-    <w:pPr>
-      <w:pStyle w:val="Header"/>
-      <w:spacing w:before="240" w:after="240"/>
-    </w:pPr>
-  </w:p>
+                        <a:ln>
+                          <a:noFill/>
+                        </a:ln>
+                      </pic:spPr>
+                    </pic:pic>
+                  </a:graphicData>
+                </a:graphic>
+              </wp:inline>
+            </w:drawing>
+          </w:r>
+        </w:p>
+      </w:tc>
+      <w:tc>
+        <w:tcPr>
+          <w:tcW w:w="5907" w:type="dxa"/>
+        </w:tcPr>
+        <w:p>
+          <w:pPr>
+            <w:rPr>
+              <w:rFonts w:ascii="Times New Roman" w:hAnsi="Times New Roman"/>
+              <w:b/>
+              <w:color w:val="0070C0"/>
+            </w:rPr>
+          </w:pPr>
+        </w:p>
+        <w:p>
+          <w:pPr>
+            <w:rPr>
+              <w:rFonts w:ascii="Times New Roman" w:hAnsi="Times New Roman"/>
+              <w:b/>
+              <w:color w:val="0070C0"/>
+            </w:rPr>
+          </w:pPr>
+          <w:r>
+            <w:rPr>
+              <w:rFonts w:ascii="Times New Roman" w:hAnsi="Times New Roman"/>
+              <w:b/>
+              <w:color w:val="0070C0"/>
+            </w:rPr>
+            <w:t>KEMENTERIAN PENDIDIKAN TINGGI, SAINS,</w:t>
+          </w:r>
+        </w:p>
+        <w:p>
+          <w:pPr>
+            <w:rPr>
+              <w:rFonts w:ascii="Times New Roman" w:hAnsi="Times New Roman"/>
+              <w:b/>
+              <w:color w:val="0070C0"/>
+            </w:rPr>
+          </w:pPr>
+          <w:r>
+            <w:rPr>
+              <w:rFonts w:ascii="Times New Roman" w:hAnsi="Times New Roman"/>
+              <w:b/>
+              <w:color w:val="0070C0"/>
+            </w:rPr>
+            <w:t>DAN TEKNOLOGI</w:t>
+          </w:r>
+        </w:p>
+        <w:p>
+          <w:pPr>
+            <w:rPr>
+              <w:rFonts w:ascii="Times New Roman" w:hAnsi="Times New Roman"/>
+              <w:b/>
+              <w:color w:val="0070C0"/>
+              <w:sz w:val="24"/>
+              <w:szCs w:val="24"/>
+            </w:rPr>
+          </w:pPr>
+          <w:r>
+            <w:rPr>
+              <w:rFonts w:ascii="Times New Roman" w:hAnsi="Times New Roman"/>
+              <w:b/>
+              <w:color w:val="0070C0"/>
+              <w:sz w:val="24"/>
+              <w:szCs w:val="24"/>
+            </w:rPr>
+            <w:t>UNIVERSITAS DIPONEGORO</w:t>
+          </w:r>
+        </w:p>
+        <w:p>
+          <w:pPr>
+            <w:rPr>
+              <w:rFonts w:ascii="Times New Roman" w:hAnsi="Times New Roman"/>
+              <w:b/>
+              <w:color w:val="0070C0"/>
+              <w:sz w:val="24"/>
+              <w:szCs w:val="24"/>
+            </w:rPr>
+          </w:pPr>
+          <w:r>
+            <w:rPr>
+              <w:rFonts w:ascii="Times New Roman" w:hAnsi="Times New Roman"/>
+              <w:b/>
+              <w:color w:val="0070C0"/>
+              <w:sz w:val="24"/>
+              <w:szCs w:val="24"/>
+            </w:rPr>
+            <w:t>FAKULTAS TEKNIK</w:t>
+          </w:r>
+        </w:p>
+        <w:p>
+          <w:pPr>
+            <w:rPr>
+              <w:rFonts w:ascii="Times New Roman" w:hAnsi="Times New Roman"/>
+              <w:b/>
+              <w:color w:val="0070C0"/>
+              <w:sz w:val="30"/>
+              <w:szCs w:val="30"/>
+            </w:rPr>
+          </w:pPr>
+          <w:r>
+            <w:rPr>
+              <w:rFonts w:ascii="Times New Roman" w:hAnsi="Times New Roman"/>
+              <w:b/>
+              <w:color w:val="0070C0"/>
+              <w:sz w:val="30"/>
+              <w:szCs w:val="30"/>
+            </w:rPr>
+            <w:t>DEPARTEMEN TEKNIK LINGKUNGAN</w:t>
+          </w:r>
+        </w:p>
+      </w:tc>
+      <w:tc>
+        <w:tcPr>
+          <w:tcW w:w="3796" w:type="dxa"/>
+        </w:tcPr>
+        <w:p>
+          <w:pPr>
+            <w:jc w:val="right"/>
+            <w:rPr>
+              <w:rFonts w:ascii="Times New Roman" w:hAnsi="Times New Roman"/>
+              <w:color w:val="0070C0"/>
+              <w:sz w:val="18"/>
+              <w:szCs w:val="18"/>
+            </w:rPr>
+          </w:pPr>
+        </w:p>
+        <w:p>
+          <w:pPr>
+            <w:jc w:val="right"/>
+            <w:rPr>
+              <w:rFonts w:ascii="Times New Roman" w:hAnsi="Times New Roman"/>
+              <w:color w:val="0070C0"/>
+              <w:sz w:val="18"/>
+              <w:szCs w:val="18"/>
+            </w:rPr>
+          </w:pPr>
+        </w:p>
+        <w:p>
+          <w:pPr>
+            <w:jc w:val="right"/>
+            <w:rPr>
+              <w:rFonts w:ascii="Times New Roman" w:hAnsi="Times New Roman"/>
+              <w:color w:val="0070C0"/>
+              <w:sz w:val="18"/>
+              <w:szCs w:val="18"/>
+            </w:rPr>
+          </w:pPr>
+        </w:p>
+        <w:p>
+          <w:pPr>
+            <w:jc w:val="right"/>
+            <w:rPr>
+              <w:rFonts w:ascii="Times New Roman" w:hAnsi="Times New Roman"/>
+              <w:color w:val="0070C0"/>
+              <w:sz w:val="18"/>
+              <w:szCs w:val="18"/>
+            </w:rPr>
+          </w:pPr>
+          <w:r>
+            <w:rPr>
+              <w:rFonts w:ascii="Times New Roman" w:hAnsi="Times New Roman"/>
+              <w:color w:val="0070C0"/>
+              <w:sz w:val="18"/>
+              <w:szCs w:val="18"/>
+            </w:rPr>
+            <w:t>Jalan Prof. Sudarto, S.H.</w:t>
+          </w:r>
+        </w:p>
+        <w:p>
+          <w:pPr>
+            <w:jc w:val="right"/>
+            <w:rPr>
+              <w:rFonts w:ascii="Times New Roman" w:hAnsi="Times New Roman"/>
+              <w:color w:val="0070C0"/>
+              <w:sz w:val="18"/>
+              <w:szCs w:val="18"/>
+            </w:rPr>
+          </w:pPr>
+          <w:r>
+            <w:rPr>
+              <w:rFonts w:ascii="Times New Roman" w:hAnsi="Times New Roman"/>
+              <w:color w:val="0070C0"/>
+              <w:sz w:val="18"/>
+              <w:szCs w:val="18"/>
+            </w:rPr>
+            <w:t>Tembalang Semarang Kode Pos 50275</w:t>
+          </w:r>
+        </w:p>
+        <w:p>
+          <w:pPr>
+            <w:jc w:val="right"/>
+            <w:rPr>
+              <w:rFonts w:ascii="Times New Roman" w:hAnsi="Times New Roman"/>
+              <w:color w:val="0070C0"/>
+              <w:sz w:val="18"/>
+              <w:szCs w:val="18"/>
+            </w:rPr>
+          </w:pPr>
+          <w:r>
+            <w:rPr>
+              <w:rFonts w:ascii="Times New Roman" w:hAnsi="Times New Roman"/>
+              <w:color w:val="0070C0"/>
+              <w:sz w:val="18"/>
+              <w:szCs w:val="18"/>
+            </w:rPr>
+            <w:t>Tel. (024) 76480678, Faks. (024) 7460053</w:t>
+          </w:r>
+        </w:p>
+        <w:p>
+          <w:pPr>
+            <w:jc w:val="right"/>
+            <w:rPr>
+              <w:rFonts w:ascii="Times New Roman" w:hAnsi="Times New Roman"/>
+              <w:color w:val="0070C0"/>
+              <w:sz w:val="18"/>
+              <w:szCs w:val="18"/>
+            </w:rPr>
+          </w:pPr>
+          <w:hyperlink r:id="rId2" w:history="1">
+            <w:r>
+              <w:rPr>
+                <w:rFonts w:ascii="Times New Roman" w:hAnsi="Times New Roman"/>
+                <w:color w:val="0070C0"/>
+                <w:sz w:val="18"/>
+                <w:szCs w:val="18"/>
+                <w:u w:val="single"/>
+              </w:rPr>
+              <w:t>www.ft.undip.ac.id</w:t>
+            </w:r>
+          </w:hyperlink>
+          <w:r>
+            <w:rPr>
+              <w:rFonts w:ascii="Times New Roman" w:hAnsi="Times New Roman"/>
+              <w:color w:val="0070C0"/>
+              <w:sz w:val="18"/>
+              <w:szCs w:val="18"/>
+            </w:rPr>
+            <w:t xml:space="preserve"> | email: enveng@live.undip.ac.id</w:t>
+          </w:r>
+        </w:p>
+      </w:tc>
+    </w:tr>
+    <w:bookmarkEnd w:id="0"/>
+    <w:bookmarkEnd w:id="1"/>
+  </w:tbl>
   <w:p>
     <w:pPr>
       <w:pStyle w:val="Header"/>
@@ -5535,7 +4974,7 @@
 </file>
 
 <file path=word/numbering.xml><?xml version="1.0" encoding="utf-8"?>
-<w:numbering xmlns:wpc="http://schemas.microsoft.com/office/word/2010/wordprocessingCanvas" xmlns:cx="http://schemas.microsoft.com/office/drawing/2014/chartex" xmlns:cx1="http://schemas.microsoft.com/office/drawing/2015/9/8/chartex" xmlns:cx2="http://schemas.microsoft.com/office/drawing/2015/10/21/chartex" xmlns:cx3="http://schemas.microsoft.com/office/drawing/2016/5/9/chartex" xmlns:cx4="http://schemas.microsoft.com/office/drawing/2016/5/10/chartex" xmlns:cx5="http://schemas.microsoft.com/office/drawing/2016/5/11/chartex" xmlns:cx6="http://schemas.microsoft.com/office/drawing/2016/5/12/chartex" xmlns:cx7="http://schemas.microsoft.com/office/drawing/2016/5/13/chartex" xmlns:cx8="http://schemas.microsoft.com/office/drawing/2016/5/14/chartex" xmlns:mc="http://schemas.openxmlformats.org/markup-compatibility/2006" xmlns:aink="http://schemas.microsoft.com/office/drawing/2016/ink" xmlns:am3d="http://schemas.microsoft.com/office/drawing/2017/model3d" xmlns:o="urn:schemas-microsoft-com:office:office" xmlns:oel="http://schemas.microsoft.com/office/2019/extlst" xmlns:r="http://schemas.openxmlformats.org/officeDocument/2006/relationships" xmlns:m="http://schemas.openxmlformats.org/officeDocument/2006/math" xmlns:v="urn:schemas-microsoft-com:vml" xmlns:wp14="http://schemas.microsoft.com/office/word/2010/wordprocessingDrawing" xmlns:wp="http://schemas.openxmlformats.org/drawingml/2006/wordprocessingDrawing" xmlns:w10="urn:schemas-microsoft-com:office:word" xmlns:w="http://schemas.openxmlformats.org/wordprocessingml/2006/main" xmlns:w14="http://schemas.microsoft.com/office/word/2010/wordml" xmlns:w15="http://schemas.microsoft.com/office/word/2012/wordml" xmlns:w16cei="http://schemas.microsoft.com/office/word/2026/wordml/cei" xmlns:w16cex="http://schemas.microsoft.com/office/word/2018/wordml/cex" xmlns:w16cid="http://schemas.microsoft.com/office/word/2016/wordml/cid" xmlns:w16="http://schemas.microsoft.com/office/word/2018/wordml" xmlns:w16du="http://schemas.microsoft.com/office/word/2023/wordml/word16du" xmlns:w16sdtdh="http://schemas.microsoft.com/office/word/2020/wordml/sdtdatahash" xmlns:w16sdtfl="http://schemas.microsoft.com/office/word/2024/wordml/sdtformatlock" xmlns:w16se="http://schemas.microsoft.com/office/word/2015/wordml/symex" xmlns:wpg="http://schemas.microsoft.com/office/word/2010/wordprocessingGroup" xmlns:wpi="http://schemas.microsoft.com/office/word/2010/wordprocessingInk" xmlns:wne="http://schemas.microsoft.com/office/word/2006/wordml" xmlns:wps="http://schemas.microsoft.com/office/word/2010/wordprocessingShape" mc:Ignorable="w14 w15 w16se w16cid w16 w16cex w16sdtdh w16sdtfl w16du wp14">
+<w:numbering xmlns:wpc="http://schemas.microsoft.com/office/word/2010/wordprocessingCanvas" xmlns:cx="http://schemas.microsoft.com/office/drawing/2014/chartex" xmlns:cx1="http://schemas.microsoft.com/office/drawing/2015/9/8/chartex" xmlns:cx2="http://schemas.microsoft.com/office/drawing/2015/10/21/chartex" xmlns:cx3="http://schemas.microsoft.com/office/drawing/2016/5/9/chartex" xmlns:cx4="http://schemas.microsoft.com/office/drawing/2016/5/10/chartex" xmlns:cx5="http://schemas.microsoft.com/office/drawing/2016/5/11/chartex" xmlns:cx6="http://schemas.microsoft.com/office/drawing/2016/5/12/chartex" xmlns:cx7="http://schemas.microsoft.com/office/drawing/2016/5/13/chartex" xmlns:cx8="http://schemas.microsoft.com/office/drawing/2016/5/14/chartex" xmlns:mc="http://schemas.openxmlformats.org/markup-compatibility/2006" xmlns:aink="http://schemas.microsoft.com/office/drawing/2016/ink" xmlns:am3d="http://schemas.microsoft.com/office/drawing/2017/model3d" xmlns:o="urn:schemas-microsoft-com:office:office" xmlns:oel="http://schemas.microsoft.com/office/2019/extlst" xmlns:r="http://schemas.openxmlformats.org/officeDocument/2006/relationships" xmlns:m="http://schemas.openxmlformats.org/officeDocument/2006/math" xmlns:v="urn:schemas-microsoft-com:vml" xmlns:wp14="http://schemas.microsoft.com/office/word/2010/wordprocessingDrawing" xmlns:wp="http://schemas.openxmlformats.org/drawingml/2006/wordprocessingDrawing" xmlns:w10="urn:schemas-microsoft-com:office:word" xmlns:w="http://schemas.openxmlformats.org/wordprocessingml/2006/main" xmlns:w14="http://schemas.microsoft.com/office/word/2010/wordml" xmlns:w15="http://schemas.microsoft.com/office/word/2012/wordml" xmlns:w16cex="http://schemas.microsoft.com/office/word/2018/wordml/cex" xmlns:w16cid="http://schemas.microsoft.com/office/word/2016/wordml/cid" xmlns:w16="http://schemas.microsoft.com/office/word/2018/wordml" xmlns:w16du="http://schemas.microsoft.com/office/word/2023/wordml/word16du" xmlns:w16sdtdh="http://schemas.microsoft.com/office/word/2020/wordml/sdtdatahash" xmlns:w16sdtfl="http://schemas.microsoft.com/office/word/2024/wordml/sdtformatlock" xmlns:w16se="http://schemas.microsoft.com/office/word/2015/wordml/symex" xmlns:wpg="http://schemas.microsoft.com/office/word/2010/wordprocessingGroup" xmlns:wpi="http://schemas.microsoft.com/office/word/2010/wordprocessingInk" xmlns:wne="http://schemas.microsoft.com/office/word/2006/wordml" xmlns:wps="http://schemas.microsoft.com/office/word/2010/wordprocessingShape" mc:Ignorable="w14 w15 w16se w16cid w16 w16cex w16sdtdh w16sdtfl w16du wp14">
   <w:abstractNum w:abstractNumId="0" w15:restartNumberingAfterBreak="0">
     <w:nsid w:val="42767A06"/>
     <w:multiLevelType w:val="hybridMultilevel"/>
@@ -6340,6 +5779,30 @@
       <w:shd w:val="clear" w:color="auto" w:fill="E1DFDD"/>
     </w:rPr>
   </w:style>
+  <w:style w:type="table" w:customStyle="1" w:styleId="TableGrid1">
+    <w:name w:val="Table Grid1"/>
+    <w:basedOn w:val="TableNormal"/>
+    <w:next w:val="TableGrid"/>
+    <w:uiPriority w:val="39"/>
+    <w:rsid w:val="00C313F2"/>
+    <w:pPr>
+      <w:spacing w:after="0" w:line="240" w:lineRule="auto"/>
+    </w:pPr>
+    <w:rPr>
+      <w:rFonts w:ascii="Abadi Extra Light" w:eastAsia="MS Mincho" w:hAnsi="Abadi Extra Light" w:cs="Arial"/>
+    </w:rPr>
+    <w:tblPr>
+      <w:tblInd w:w="0" w:type="nil"/>
+      <w:tblBorders>
+        <w:top w:val="single" w:sz="4" w:space="0" w:color="auto"/>
+        <w:left w:val="single" w:sz="4" w:space="0" w:color="auto"/>
+        <w:bottom w:val="single" w:sz="4" w:space="0" w:color="auto"/>
+        <w:right w:val="single" w:sz="4" w:space="0" w:color="auto"/>
+        <w:insideH w:val="single" w:sz="4" w:space="0" w:color="auto"/>
+        <w:insideV w:val="single" w:sz="4" w:space="0" w:color="auto"/>
+      </w:tblBorders>
+    </w:tblPr>
+  </w:style>
 </w:styles>
 </file>
 

</xml_diff>